<commit_message>
Subida de entrega en formato PDF
</commit_message>
<xml_diff>
--- a/2DO_CORTE/2_Algoritmos_Caminos_Mas_Cortos/Proyectos/Informe_No.2.2.docx
+++ b/2DO_CORTE/2_Algoritmos_Caminos_Mas_Cortos/Proyectos/Informe_No.2.2.docx
@@ -1402,17 +1402,84 @@
           <w:rFonts w:ascii="Times New Roman" w:hAnsi="Times New Roman" w:cs="Times New Roman"/>
           <w:sz w:val="24"/>
           <w:szCs w:val="24"/>
-        </w:rPr>
-      </w:pPr>
-      <w:r>
-        <w:rPr>
-          <w:rFonts w:ascii="Times New Roman" w:hAnsi="Times New Roman" w:cs="Times New Roman"/>
-          <w:sz w:val="24"/>
-          <w:szCs w:val="24"/>
           <w:lang w:val="es-ES"/>
         </w:rPr>
+      </w:pPr>
+      <w:r>
+        <w:rPr>
+          <w:rFonts w:ascii="Times New Roman" w:hAnsi="Times New Roman" w:cs="Times New Roman"/>
+          <w:sz w:val="24"/>
+          <w:szCs w:val="24"/>
+          <w:lang w:val="es-ES"/>
+        </w:rPr>
         <w:t xml:space="preserve">LINK DEL REPOSITORIO: </w:t>
       </w:r>
+      <w:hyperlink r:id="rId5" w:history="1">
+        <w:r>
+          <w:rPr>
+            <w:rStyle w:val="Hipervnculo"/>
+            <w:rFonts w:ascii="Times New Roman" w:hAnsi="Times New Roman" w:cs="Times New Roman"/>
+            <w:sz w:val="24"/>
+            <w:szCs w:val="24"/>
+            <w:lang w:val="es-ES"/>
+          </w:rPr>
+          <w:t>https://github.com/Jimmy86gb/CC2_GR5_020_84.git</w:t>
+        </w:r>
+      </w:hyperlink>
+    </w:p>
+    <w:p>
+      <w:pPr>
+        <w:spacing w:line="360" w:lineRule="auto"/>
+        <w:rPr>
+          <w:rFonts w:ascii="Times New Roman" w:hAnsi="Times New Roman" w:cs="Times New Roman"/>
+          <w:sz w:val="24"/>
+          <w:szCs w:val="24"/>
+        </w:rPr>
+      </w:pPr>
+      <w:r>
+        <w:rPr>
+          <w:rFonts w:ascii="Times New Roman" w:hAnsi="Times New Roman" w:cs="Times New Roman"/>
+          <w:sz w:val="24"/>
+          <w:szCs w:val="24"/>
+        </w:rPr>
+        <w:t xml:space="preserve">Ruta de Entrega: </w:t>
+      </w:r>
+      <w:r>
+        <w:rPr>
+          <w:rFonts w:ascii="Times New Roman" w:hAnsi="Times New Roman" w:cs="Times New Roman"/>
+          <w:sz w:val="24"/>
+          <w:szCs w:val="24"/>
+        </w:rPr>
+        <w:t>2DO_CORTE/2_Algoritmos_Caminos_Mas_Cortos</w:t>
+      </w:r>
+      <w:r>
+        <w:rPr>
+          <w:rFonts w:ascii="Times New Roman" w:hAnsi="Times New Roman" w:cs="Times New Roman"/>
+          <w:sz w:val="24"/>
+          <w:szCs w:val="24"/>
+        </w:rPr>
+        <w:t>/Entrega</w:t>
+      </w:r>
+    </w:p>
+    <w:p>
+      <w:pPr>
+        <w:spacing w:line="360" w:lineRule="auto"/>
+        <w:rPr>
+          <w:rFonts w:ascii="Times New Roman" w:hAnsi="Times New Roman" w:cs="Times New Roman"/>
+          <w:sz w:val="24"/>
+          <w:szCs w:val="24"/>
+        </w:rPr>
+      </w:pPr>
+    </w:p>
+    <w:p>
+      <w:pPr>
+        <w:spacing w:line="360" w:lineRule="auto"/>
+        <w:rPr>
+          <w:rFonts w:ascii="Times New Roman" w:hAnsi="Times New Roman" w:cs="Times New Roman"/>
+          <w:sz w:val="24"/>
+          <w:szCs w:val="24"/>
+        </w:rPr>
+      </w:pPr>
     </w:p>
     <w:p>
       <w:pPr>
@@ -4989,7 +5056,7 @@
                     <pic:cNvPicPr/>
                   </pic:nvPicPr>
                   <pic:blipFill>
-                    <a:blip r:embed="rId5">
+                    <a:blip r:embed="rId6">
                       <a:extLst>
                         <a:ext uri="{28A0092B-C50C-407E-A947-70E740481C1C}">
                           <a14:useLocalDpi xmlns:a14="http://schemas.microsoft.com/office/drawing/2010/main"/>
@@ -5165,7 +5232,7 @@
                     <pic:cNvPicPr/>
                   </pic:nvPicPr>
                   <pic:blipFill>
-                    <a:blip r:embed="rId6">
+                    <a:blip r:embed="rId7">
                       <a:extLst>
                         <a:ext uri="{28A0092B-C50C-407E-A947-70E740481C1C}">
                           <a14:useLocalDpi xmlns:a14="http://schemas.microsoft.com/office/drawing/2010/main"/>
@@ -5342,7 +5409,7 @@
                     <pic:cNvPicPr/>
                   </pic:nvPicPr>
                   <pic:blipFill>
-                    <a:blip r:embed="rId7">
+                    <a:blip r:embed="rId8">
                       <a:extLst>
                         <a:ext uri="{28A0092B-C50C-407E-A947-70E740481C1C}">
                           <a14:useLocalDpi xmlns:a14="http://schemas.microsoft.com/office/drawing/2010/main"/>
@@ -5487,7 +5554,7 @@
                     <pic:cNvPicPr/>
                   </pic:nvPicPr>
                   <pic:blipFill>
-                    <a:blip r:embed="rId8">
+                    <a:blip r:embed="rId9">
                       <a:extLst>
                         <a:ext uri="{28A0092B-C50C-407E-A947-70E740481C1C}">
                           <a14:useLocalDpi xmlns:a14="http://schemas.microsoft.com/office/drawing/2010/main"/>
@@ -5652,7 +5719,7 @@
                     <pic:cNvPicPr/>
                   </pic:nvPicPr>
                   <pic:blipFill>
-                    <a:blip r:embed="rId9">
+                    <a:blip r:embed="rId10">
                       <a:extLst>
                         <a:ext uri="{28A0092B-C50C-407E-A947-70E740481C1C}">
                           <a14:useLocalDpi xmlns:a14="http://schemas.microsoft.com/office/drawing/2010/main"/>
@@ -5797,7 +5864,7 @@
                     <pic:cNvPicPr/>
                   </pic:nvPicPr>
                   <pic:blipFill>
-                    <a:blip r:embed="rId10">
+                    <a:blip r:embed="rId11">
                       <a:extLst>
                         <a:ext uri="{28A0092B-C50C-407E-A947-70E740481C1C}">
                           <a14:useLocalDpi xmlns:a14="http://schemas.microsoft.com/office/drawing/2010/main"/>
@@ -9247,6 +9314,8 @@
   <w:style w:type="table" w:default="1" w:styleId="Tablanormal">
     <w:name w:val="Normal Table"/>
     <w:uiPriority w:val="99"/>
+    <w:semiHidden/>
+    <w:unhideWhenUsed/>
     <w:tblPr>
       <w:tblInd w:w="0" w:type="dxa"/>
       <w:tblCellMar>
@@ -9459,6 +9528,18 @@
         <w:insideV w:val="single" w:sz="4" w:space="0" w:color="000000" w:themeColor="text1"/>
       </w:tblBorders>
     </w:tblPr>
+  </w:style>
+  <w:style w:type="character" w:styleId="Mencinsinresolver">
+    <w:name w:val="Unresolved Mention"/>
+    <w:basedOn w:val="Fuentedeprrafopredeter"/>
+    <w:uiPriority w:val="99"/>
+    <w:semiHidden/>
+    <w:unhideWhenUsed/>
+    <w:rsid w:val="004D39AC"/>
+    <w:rPr>
+      <w:color w:val="605E5C"/>
+      <w:shd w:val="clear" w:color="auto" w:fill="E1DFDD"/>
+    </w:rPr>
   </w:style>
 </w:styles>
 </file>

</xml_diff>